<commit_message>
Agregar autoevaluación de la Fase 1 y resumen, abstract y reflexión en inglés en la guía
</commit_message>
<xml_diff>
--- a/Fase 1/Evidencias Grupales/1.5_GuiaEstudiante_Fase 1_Definicion Proyecto APT (Español).docx
+++ b/Fase 1/Evidencias Grupales/1.5_GuiaEstudiante_Fase 1_Definicion Proyecto APT (Español).docx
@@ -8816,6 +8816,157 @@
       </w:r>
     </w:p>
     <w:p/>
+    <w:p>
+      <w:pPr>
+        <w:keepNext/>
+        <w:pageBreakBefore/>
+        <w:spacing w:before="240" w:after="120" w:line="276" w:lineRule="auto"/>
+        <w:jc w:val="left"/>
+      </w:pPr>
+      <w:r>
+        <w:rPr>
+          <w:rFonts w:ascii="Calibri" w:hAnsi="Calibri" w:cs="Calibri" w:eastAsia="Calibri"/>
+          <w:b/>
+          <w:bCs/>
+          <w:color w:val="1F3864"/>
+          <w:sz w:val="28"/>
+          <w:szCs w:val="28"/>
+        </w:rPr>
+        <w:t xml:space="preserve">Anexo. Resumen, abstract, conclusiones y reflexión</w:t>
+      </w:r>
+    </w:p>
+    <w:p>
+      <w:pPr>
+        <w:keepNext/>
+        <w:spacing w:before="240" w:after="120" w:line="276" w:lineRule="auto"/>
+        <w:jc w:val="left"/>
+      </w:pPr>
+      <w:r>
+        <w:rPr>
+          <w:rFonts w:ascii="Calibri" w:hAnsi="Calibri" w:cs="Calibri" w:eastAsia="Calibri"/>
+          <w:b/>
+          <w:bCs/>
+          <w:color w:val="1F3864"/>
+          <w:sz w:val="24"/>
+          <w:szCs w:val="24"/>
+        </w:rPr>
+        <w:t xml:space="preserve">Resumen</w:t>
+      </w:r>
+    </w:p>
+    <w:p>
+      <w:pPr>
+        <w:spacing w:before="0" w:after="120" w:line="276" w:lineRule="auto"/>
+        <w:jc w:val="both"/>
+      </w:pPr>
+      <w:r>
+        <w:rPr>
+          <w:rFonts w:ascii="Calibri" w:hAnsi="Calibri" w:cs="Calibri" w:eastAsia="Calibri"/>
+          <w:color w:val="000000"/>
+          <w:sz w:val="22"/>
+          <w:szCs w:val="22"/>
+        </w:rPr>
+        <w:t xml:space="preserve">Clancy's Rewards es una aplicación móvil de fidelización para Clancy's, un pub y restaurante del centro de Cork, Irlanda. Reemplaza la tarjeta de sellos de papel por visitas validadas con un código QR de un solo uso que escanea el personal, y le entrega al local información sobre la frecuencia de sus clientes. Este documento define el proyecto: su fundamentación, los objetivos, la metodología Scrum en sprints de dos semanas, las evidencias y el plan de trabajo para llevar el prototipo actual a producción y publicarlo en Google Play.</w:t>
+      </w:r>
+    </w:p>
+    <w:p>
+      <w:pPr>
+        <w:keepNext/>
+        <w:spacing w:before="240" w:after="120" w:line="276" w:lineRule="auto"/>
+        <w:jc w:val="left"/>
+      </w:pPr>
+      <w:r>
+        <w:rPr>
+          <w:rFonts w:ascii="Calibri" w:hAnsi="Calibri" w:cs="Calibri" w:eastAsia="Calibri"/>
+          <w:b/>
+          <w:bCs/>
+          <w:color w:val="1F3864"/>
+          <w:sz w:val="24"/>
+          <w:szCs w:val="24"/>
+        </w:rPr>
+        <w:t xml:space="preserve">Abstract</w:t>
+      </w:r>
+    </w:p>
+    <w:p>
+      <w:pPr>
+        <w:spacing w:before="0" w:after="120" w:line="276" w:lineRule="auto"/>
+        <w:jc w:val="both"/>
+      </w:pPr>
+      <w:r>
+        <w:rPr>
+          <w:rFonts w:ascii="Calibri" w:hAnsi="Calibri" w:cs="Calibri" w:eastAsia="Calibri"/>
+          <w:color w:val="000000"/>
+          <w:sz w:val="22"/>
+          <w:szCs w:val="22"/>
+        </w:rPr>
+        <w:t xml:space="preserve">Clancy's Rewards is a mobile loyalty app for Clancy's, a pub and restaurant in Cork city centre, Ireland. It replaces the paper stamp card with visits validated through a single-use QR code that staff scan, and it gives the business information about how often its customers come back. This document defines the project: its rationale, objectives, a Scrum methodology with two-week sprints, the evidence to be delivered and the work plan to take the current prototype to production and release it on Google Play.</w:t>
+      </w:r>
+    </w:p>
+    <w:p>
+      <w:pPr>
+        <w:keepNext/>
+        <w:spacing w:before="240" w:after="120" w:line="276" w:lineRule="auto"/>
+        <w:jc w:val="left"/>
+      </w:pPr>
+      <w:r>
+        <w:rPr>
+          <w:rFonts w:ascii="Calibri" w:hAnsi="Calibri" w:cs="Calibri" w:eastAsia="Calibri"/>
+          <w:b/>
+          <w:bCs/>
+          <w:color w:val="1F3864"/>
+          <w:sz w:val="24"/>
+          <w:szCs w:val="24"/>
+        </w:rPr>
+        <w:t xml:space="preserve">Individual conclusions</w:t>
+      </w:r>
+    </w:p>
+    <w:p>
+      <w:pPr>
+        <w:spacing w:before="0" w:after="120" w:line="276" w:lineRule="auto"/>
+        <w:jc w:val="both"/>
+      </w:pPr>
+      <w:r>
+        <w:rPr>
+          <w:rFonts w:ascii="Calibri" w:hAnsi="Calibri" w:cs="Calibri" w:eastAsia="Calibri"/>
+          <w:color w:val="000000"/>
+          <w:sz w:val="22"/>
+          <w:szCs w:val="22"/>
+        </w:rPr>
+        <w:t xml:space="preserve">The project is feasible within the semester because the prototype already covers the main flow: sign-up, QR code, scanning, visits and rewards. The remaining work is not about adding many new features, but about making the app safe, deploying it, complying with the GDPR and releasing it. The biggest risks are the Google Play closed test, which takes at least 14 days, and the time I have available while I work and study.</w:t>
+      </w:r>
+    </w:p>
+    <w:p>
+      <w:pPr>
+        <w:keepNext/>
+        <w:spacing w:before="240" w:after="120" w:line="276" w:lineRule="auto"/>
+        <w:jc w:val="left"/>
+      </w:pPr>
+      <w:r>
+        <w:rPr>
+          <w:rFonts w:ascii="Calibri" w:hAnsi="Calibri" w:cs="Calibri" w:eastAsia="Calibri"/>
+          <w:b/>
+          <w:bCs/>
+          <w:color w:val="1F3864"/>
+          <w:sz w:val="24"/>
+          <w:szCs w:val="24"/>
+        </w:rPr>
+        <w:t xml:space="preserve">Reflection</w:t>
+      </w:r>
+    </w:p>
+    <w:p>
+      <w:pPr>
+        <w:spacing w:before="0" w:after="120" w:line="276" w:lineRule="auto"/>
+        <w:jc w:val="both"/>
+      </w:pPr>
+      <w:r>
+        <w:rPr>
+          <w:rFonts w:ascii="Calibri" w:hAnsi="Calibri" w:cs="Calibri" w:eastAsia="Calibri"/>
+          <w:color w:val="000000"/>
+          <w:sz w:val="22"/>
+          <w:szCs w:val="22"/>
+        </w:rPr>
+        <w:t xml:space="preserve">Defining this project helped me see the difference between a prototype that works on my computer and a product that a real business can use. I chose a real problem from the place where I work, which makes the project more meaningful for me and easier to validate with real users. It also showed me which skills I need to improve, mainly security and testing, and it gives me a clear goal for the rest of the semester.</w:t>
+      </w:r>
+    </w:p>
     <w:sectPr>
       <w:headerReference w:type="default" r:id="rId10"/>
       <w:pgSz w:w="11906" w:h="16838"/>

</xml_diff>